<commit_message>
Liens certifications dans CV, URL portfolio mise à jour, bouton Word retiré
</commit_message>
<xml_diff>
--- a/public/assets/CV_Adama_Ndiaye.docx
+++ b/public/assets/CV_Adama_Ndiaye.docx
@@ -32,7 +32,7 @@
     </w:p>
     <w:p>
       <w:pPr>
-        <w:spacing w:after="200" w:before="0"/>
+        <w:spacing w:after="40" w:before="0"/>
       </w:pPr>
       <w:r>
         <w:rPr>
@@ -40,8 +40,43 @@
           <w:sz w:val="17"/>
           <w:szCs w:val="17"/>
         </w:rPr>
-        <w:t xml:space="preserve">adamandiaye.works@gmail.com   |   +221 76 271 48 88   |   Dakar, Sénégal   |   linkedin.com/in/adamandiayeworks</w:t>
-      </w:r>
+        <w:t xml:space="preserve">adamandiaye.works@gmail.com   |   +221 76 271 48 88   |   Dakar, Sénégal</w:t>
+      </w:r>
+    </w:p>
+    <w:p>
+      <w:pPr>
+        <w:spacing w:after="200" w:before="0"/>
+      </w:pPr>
+      <w:hyperlink w:history="1" r:id="rIdwc1rtlo6byz_rm3wbvftd">
+        <w:r>
+          <w:rPr>
+            <w:color w:val="1565C0"/>
+            <w:sz w:val="17"/>
+            <w:szCs w:val="17"/>
+            <w:u w:val="single"/>
+          </w:rPr>
+          <w:t xml:space="preserve">linkedin.com/in/adamandiayeworks</w:t>
+        </w:r>
+      </w:hyperlink>
+      <w:r>
+        <w:rPr>
+          <w:color w:val="718096"/>
+          <w:sz w:val="17"/>
+          <w:szCs w:val="17"/>
+        </w:rPr>
+        <w:t xml:space="preserve">   |   </w:t>
+      </w:r>
+      <w:hyperlink w:history="1" r:id="rIdwpy9zrrzajwp8afhtpb--">
+        <w:r>
+          <w:rPr>
+            <w:color w:val="1565C0"/>
+            <w:sz w:val="17"/>
+            <w:szCs w:val="17"/>
+            <w:u w:val="single"/>
+          </w:rPr>
+          <w:t xml:space="preserve">adamandiayeworks.vercel.app</w:t>
+        </w:r>
+      </w:hyperlink>
     </w:p>
     <w:p>
       <w:pPr>
@@ -477,16 +512,19 @@
         </w:rPr>
         <w:t xml:space="preserve">★  </w:t>
       </w:r>
-      <w:r>
-        <w:rPr>
-          <w:b/>
-          <w:bCs/>
-          <w:color w:val="1A1A2E"/>
-          <w:sz w:val="21"/>
-          <w:szCs w:val="21"/>
-        </w:rPr>
-        <w:t xml:space="preserve">Salesforce Sales Operations</w:t>
-      </w:r>
+      <w:hyperlink w:history="1" r:id="rIdnlfpgnrwyilvvk_o7rkze">
+        <w:r>
+          <w:rPr>
+            <w:b/>
+            <w:bCs/>
+            <w:color w:val="1565C0"/>
+            <w:sz w:val="21"/>
+            <w:szCs w:val="21"/>
+            <w:u w:val="single"/>
+          </w:rPr>
+          <w:t xml:space="preserve">Salesforce Sales Operations</w:t>
+        </w:r>
+      </w:hyperlink>
       <w:r>
         <w:rPr>
           <w:color w:val="718096"/>
@@ -510,16 +548,19 @@
         </w:rPr>
         <w:t xml:space="preserve">›  </w:t>
       </w:r>
-      <w:r>
-        <w:rPr>
-          <w:b w:val="false"/>
-          <w:bCs w:val="false"/>
-          <w:color w:val="1A1A2E"/>
-          <w:sz w:val="20"/>
-          <w:szCs w:val="20"/>
-        </w:rPr>
-        <w:t xml:space="preserve">Gestion des prospects dans Salesforce</w:t>
-      </w:r>
+      <w:hyperlink w:history="1" r:id="rIdd2r7peoni0gjgoi7ajcd7">
+        <w:r>
+          <w:rPr>
+            <w:b w:val="false"/>
+            <w:bCs w:val="false"/>
+            <w:color w:val="1565C0"/>
+            <w:sz w:val="20"/>
+            <w:szCs w:val="20"/>
+            <w:u w:val="single"/>
+          </w:rPr>
+          <w:t xml:space="preserve">Gestion des prospects dans Salesforce</w:t>
+        </w:r>
+      </w:hyperlink>
       <w:r>
         <w:rPr>
           <w:color w:val="718096"/>
@@ -543,16 +584,19 @@
         </w:rPr>
         <w:t xml:space="preserve">›  </w:t>
       </w:r>
-      <w:r>
-        <w:rPr>
-          <w:b w:val="false"/>
-          <w:bCs w:val="false"/>
-          <w:color w:val="1A1A2E"/>
-          <w:sz w:val="20"/>
-          <w:szCs w:val="20"/>
-        </w:rPr>
-        <w:t xml:space="preserve">Gestion des opportunités dans Salesforce</w:t>
-      </w:r>
+      <w:hyperlink w:history="1" r:id="rIdjrraso6yb2zfky66wpwr1">
+        <w:r>
+          <w:rPr>
+            <w:b w:val="false"/>
+            <w:bCs w:val="false"/>
+            <w:color w:val="1565C0"/>
+            <w:sz w:val="20"/>
+            <w:szCs w:val="20"/>
+            <w:u w:val="single"/>
+          </w:rPr>
+          <w:t xml:space="preserve">Gestion des opportunités dans Salesforce</w:t>
+        </w:r>
+      </w:hyperlink>
       <w:r>
         <w:rPr>
           <w:color w:val="718096"/>
@@ -576,16 +620,19 @@
         </w:rPr>
         <w:t xml:space="preserve">›  </w:t>
       </w:r>
-      <w:r>
-        <w:rPr>
-          <w:b w:val="false"/>
-          <w:bCs w:val="false"/>
-          <w:color w:val="1A1A2E"/>
-          <w:sz w:val="20"/>
-          <w:szCs w:val="20"/>
-        </w:rPr>
-        <w:t xml:space="preserve">Vue d'ensemble des ventes et de la GRC</w:t>
-      </w:r>
+      <w:hyperlink w:history="1" r:id="rIdgancgtm4uvj7pej3erkct">
+        <w:r>
+          <w:rPr>
+            <w:b w:val="false"/>
+            <w:bCs w:val="false"/>
+            <w:color w:val="1565C0"/>
+            <w:sz w:val="20"/>
+            <w:szCs w:val="20"/>
+            <w:u w:val="single"/>
+          </w:rPr>
+          <w:t xml:space="preserve">Vue d'ensemble des ventes et de la GRC</w:t>
+        </w:r>
+      </w:hyperlink>
       <w:r>
         <w:rPr>
           <w:color w:val="718096"/>
@@ -609,16 +656,19 @@
         </w:rPr>
         <w:t xml:space="preserve">›  </w:t>
       </w:r>
-      <w:r>
-        <w:rPr>
-          <w:b w:val="false"/>
-          <w:bCs w:val="false"/>
-          <w:color w:val="1A1A2E"/>
-          <w:sz w:val="20"/>
-          <w:szCs w:val="20"/>
-        </w:rPr>
-        <w:t xml:space="preserve">Rapports, tableaux de bord et réussite clients dans Salesforce</w:t>
-      </w:r>
+      <w:hyperlink w:history="1" r:id="rId3nnzotckmwnakzjke3dhs">
+        <w:r>
+          <w:rPr>
+            <w:b w:val="false"/>
+            <w:bCs w:val="false"/>
+            <w:color w:val="1565C0"/>
+            <w:sz w:val="20"/>
+            <w:szCs w:val="20"/>
+            <w:u w:val="single"/>
+          </w:rPr>
+          <w:t xml:space="preserve">Rapports, tableaux de bord et réussite clients dans Salesforce</w:t>
+        </w:r>
+      </w:hyperlink>
       <w:r>
         <w:rPr>
           <w:color w:val="718096"/>
@@ -642,16 +692,19 @@
         </w:rPr>
         <w:t xml:space="preserve">›  </w:t>
       </w:r>
-      <w:r>
-        <w:rPr>
-          <w:b w:val="false"/>
-          <w:bCs w:val="false"/>
-          <w:color w:val="1A1A2E"/>
-          <w:sz w:val="20"/>
-          <w:szCs w:val="20"/>
-        </w:rPr>
-        <w:t xml:space="preserve">Données pour les analystes commerciaux – Microsoft Excel</w:t>
-      </w:r>
+      <w:hyperlink w:history="1" r:id="rIdzxuv9lrorj1qmjisxxszd">
+        <w:r>
+          <w:rPr>
+            <w:b w:val="false"/>
+            <w:bCs w:val="false"/>
+            <w:color w:val="1565C0"/>
+            <w:sz w:val="20"/>
+            <w:szCs w:val="20"/>
+            <w:u w:val="single"/>
+          </w:rPr>
+          <w:t xml:space="preserve">Données pour les analystes commerciaux – Microsoft Excel</w:t>
+        </w:r>
+      </w:hyperlink>
       <w:r>
         <w:rPr>
           <w:color w:val="718096"/>
@@ -675,16 +728,19 @@
         </w:rPr>
         <w:t xml:space="preserve">›  </w:t>
       </w:r>
-      <w:r>
-        <w:rPr>
-          <w:b w:val="false"/>
-          <w:bCs w:val="false"/>
-          <w:color w:val="1A1A2E"/>
-          <w:sz w:val="20"/>
-          <w:szCs w:val="20"/>
-        </w:rPr>
-        <w:t xml:space="preserve">Principes fondamentaux de l'analyse d'entreprise</w:t>
-      </w:r>
+      <w:hyperlink w:history="1" r:id="rIdgitvd2ndlgc2sb9rsuwqg">
+        <w:r>
+          <w:rPr>
+            <w:b w:val="false"/>
+            <w:bCs w:val="false"/>
+            <w:color w:val="1565C0"/>
+            <w:sz w:val="20"/>
+            <w:szCs w:val="20"/>
+            <w:u w:val="single"/>
+          </w:rPr>
+          <w:t xml:space="preserve">Principes fondamentaux de l'analyse d'entreprise</w:t>
+        </w:r>
+      </w:hyperlink>
       <w:r>
         <w:rPr>
           <w:color w:val="718096"/>

</xml_diff>